<commit_message>
docs: update resume and portfolio materials
</commit_message>
<xml_diff>
--- a/output/김종록_백엔드_AI응용개발자_이력서.docx
+++ b/output/김종록_백엔드_AI응용개발자_이력서.docx
@@ -176,7 +176,7 @@
           <w:color w:val="13283F"/>
           <w:sz w:val="17"/>
         </w:rPr>
-        <w:t>5인 팀 Project Leader로 API 계약, 기능 범위, 테스트와 시연 자료를 조율</w:t>
+        <w:t>5인 팀 프로젝트 리더(PL)로 API 계약, 기능 범위, 테스트와 시연 자료를 조율</w:t>
       </w:r>
     </w:p>
     <w:p>
@@ -499,7 +499,7 @@
           <w:color w:val="13283F"/>
           <w:sz w:val="17"/>
         </w:rPr>
-        <w:t>코로나19 기간 전자결재·원격 OA 접근 체계 전환을 지원하며 중단 없는 업무 환경 유지</w:t>
+        <w:t>코로나19 기간 전자결재·원격 OA 접근 체계 전환 과정에서 사용자 안내와 장애 대응 지원</w:t>
       </w:r>
     </w:p>
     <w:p>
@@ -771,7 +771,7 @@
           <w:color w:val="13283F"/>
           <w:sz w:val="20"/>
         </w:rPr>
-        <w:t>Intelligent Traffic Agent · Vision-to-Text 지능형 교통 관제</w:t>
+        <w:t>지능형 교통 관제 시스템</w:t>
       </w:r>
       <w:r>
         <w:rPr>
@@ -829,7 +829,7 @@
           <w:color w:val="13283F"/>
           <w:sz w:val="20"/>
         </w:rPr>
-        <w:t>Traffic Anomaly Detection · CCTV 교통량 이상탐지·예측</w:t>
+        <w:t>CCTV 교통량 이상탐지·예측</w:t>
       </w:r>
       <w:r>
         <w:rPr>
@@ -887,7 +887,7 @@
           <w:color w:val="13283F"/>
           <w:sz w:val="20"/>
         </w:rPr>
-        <w:t>Flight Delay Prediction · 항공편 지연 예측</w:t>
+        <w:t>항공편 지연 예측</w:t>
       </w:r>
       <w:r>
         <w:rPr>
@@ -945,7 +945,7 @@
           <w:color w:val="13283F"/>
           <w:sz w:val="20"/>
         </w:rPr>
-        <w:t>BidMatch Flask Prototype · 맞춤 공고 자동 수집·메일 알림</w:t>
+        <w:t>맞춤 공고 자동 수집·메일 알림 프로토타입</w:t>
       </w:r>
       <w:r>
         <w:rPr>
@@ -989,6 +989,78 @@
           <w:sz w:val="17"/>
         </w:rPr>
         <w:t>UTC/KST 발송 시간 차이를 Asia/Seoul 기준으로 보정하고 최종 Spring·FastAPI 프로젝트로 구조 확장</w:t>
+      </w:r>
+    </w:p>
+    <w:p>
+      <w:pPr>
+        <w:keepNext/>
+        <w:spacing w:before="70" w:after="28"/>
+      </w:pPr>
+      <w:r>
+        <w:rPr>
+          <w:rFonts w:ascii="맑은 고딕" w:hAnsi="맑은 고딕" w:eastAsia="맑은 고딕"/>
+          <w:b/>
+          <w:color w:val="13283F"/>
+          <w:sz w:val="20"/>
+        </w:rPr>
+        <w:t>Spike · Spring Boot 기반 금융 서비스</w:t>
+      </w:r>
+      <w:r>
+        <w:rPr>
+          <w:rFonts w:ascii="맑은 고딕" w:hAnsi="맑은 고딕" w:eastAsia="맑은 고딕"/>
+          <w:b w:val="0"/>
+          <w:color w:val="5C6670"/>
+          <w:sz w:val="16"/>
+        </w:rPr>
+        <w:t xml:space="preserve">  |  2025.01 – 2025.02 · 팀 프로젝트</w:t>
+      </w:r>
+    </w:p>
+    <w:p>
+      <w:pPr>
+        <w:pStyle w:val="ListBullet"/>
+        <w:keepLines/>
+        <w:spacing w:after="24" w:line="259" w:lineRule="auto"/>
+        <w:ind w:left="255" w:hanging="125"/>
+      </w:pPr>
+      <w:r>
+        <w:rPr>
+          <w:rFonts w:ascii="맑은 고딕" w:hAnsi="맑은 고딕" w:eastAsia="맑은 고딕"/>
+          <w:b w:val="0"/>
+          <w:color w:val="13283F"/>
+          <w:sz w:val="17"/>
+        </w:rPr>
+        <w:t>Spring Security와 BCrypt를 적용한 회원가입·로그인, 역할별 접근 제어와 마이페이지 구현</w:t>
+      </w:r>
+    </w:p>
+    <w:p>
+      <w:pPr>
+        <w:pStyle w:val="ListBullet"/>
+        <w:keepLines/>
+        <w:spacing w:after="24" w:line="259" w:lineRule="auto"/>
+        <w:ind w:left="255" w:hanging="125"/>
+      </w:pPr>
+      <w:r>
+        <w:rPr>
+          <w:rFonts w:ascii="맑은 고딕" w:hAnsi="맑은 고딕" w:eastAsia="맑은 고딕"/>
+          <w:b w:val="0"/>
+          <w:color w:val="13283F"/>
+          <w:sz w:val="17"/>
+        </w:rPr>
+        <w:t>관리자 사용자 CRUD·페이징과 보이스피싱 의심 계좌 신고·검토·상태 변경 흐름 구현</w:t>
+      </w:r>
+    </w:p>
+    <w:p>
+      <w:pPr>
+        <w:spacing w:after="40" w:line="271" w:lineRule="auto"/>
+      </w:pPr>
+      <w:r>
+        <w:rPr>
+          <w:rFonts w:ascii="맑은 고딕" w:hAnsi="맑은 고딕" w:eastAsia="맑은 고딕"/>
+          <w:b w:val="0"/>
+          <w:color w:val="159A9C"/>
+          <w:sz w:val="16"/>
+        </w:rPr>
+        <w:t>기술: Java 17 · Spring Boot 2.7 · JSP · JPA · MyBatis · Oracle DB</w:t>
       </w:r>
     </w:p>
     <w:p>

</xml_diff>

<commit_message>
feat: update portfolio and resume materials
</commit_message>
<xml_diff>
--- a/output/김종록_백엔드_AI응용개발자_이력서.docx
+++ b/output/김종록_백엔드_AI응용개발자_이력서.docx
@@ -32,8 +32,18 @@
     </w:p>
     <w:p>
       <w:pPr>
-        <w:spacing w:after="140" w:line="240" w:lineRule="auto"/>
+        <w:spacing w:after="20" w:line="240" w:lineRule="auto"/>
       </w:pPr>
+      <w:hyperlink r:id="rId9">
+        <w:r>
+          <w:rPr>
+            <w:rFonts w:ascii="맑은 고딕" w:hAnsi="맑은 고딕" w:eastAsia="맑은 고딕"/>
+            <w:b w:val="0"/>
+            <w:color w:val="5C6670"/>
+            <w:sz w:val="17"/>
+          </w:rPr>
+        </w:r>
+      </w:hyperlink>
       <w:r>
         <w:rPr>
           <w:rFonts w:ascii="맑은 고딕" w:hAnsi="맑은 고딕" w:eastAsia="맑은 고딕"/>
@@ -41,17 +51,70 @@
           <w:color w:val="5C6670"/>
           <w:sz w:val="17"/>
         </w:rPr>
-        <w:t xml:space="preserve">010-7742-1623  |  xhxhahs2@gmail.com  |  경기 하남시  |  </w:t>
+        <w:t xml:space="preserve">  |  </w:t>
       </w:r>
+      <w:hyperlink r:id="rId10">
+        <w:r>
+          <w:rPr>
+            <w:rFonts w:ascii="맑은 고딕" w:hAnsi="맑은 고딕" w:eastAsia="맑은 고딕"/>
+            <w:b w:val="0"/>
+            <w:color w:val="5C6670"/>
+            <w:sz w:val="17"/>
+          </w:rPr>
+        </w:r>
+      </w:hyperlink>
+      <w:r>
+        <w:rPr>
+          <w:rFonts w:ascii="맑은 고딕" w:hAnsi="맑은 고딕" w:eastAsia="맑은 고딕"/>
+          <w:b w:val="0"/>
+          <w:color w:val="5C6670"/>
+          <w:sz w:val="17"/>
+        </w:rPr>
+        <w:t xml:space="preserve">  |  경기 하남시</w:t>
+      </w:r>
+    </w:p>
+    <w:p>
+      <w:pPr>
+        <w:spacing w:after="140" w:line="240" w:lineRule="auto"/>
+      </w:pPr>
       <w:r>
         <w:rPr>
           <w:rFonts w:ascii="맑은 고딕" w:hAnsi="맑은 고딕" w:eastAsia="맑은 고딕"/>
           <w:b/>
-          <w:color w:val="159A9C"/>
+          <w:color w:val="13283F"/>
           <w:sz w:val="17"/>
         </w:rPr>
-        <w:t>github.com/kjongrok</w:t>
+        <w:t xml:space="preserve">Portfolio  </w:t>
       </w:r>
+      <w:hyperlink r:id="rId11">
+        <w:r>
+          <w:rPr>
+            <w:rFonts w:ascii="맑은 고딕" w:hAnsi="맑은 고딕" w:eastAsia="맑은 고딕"/>
+            <w:b/>
+            <w:color w:val="159A9C"/>
+            <w:sz w:val="17"/>
+          </w:rPr>
+        </w:r>
+      </w:hyperlink>
+      <w:r>
+        <w:rPr>
+          <w:rFonts w:ascii="맑은 고딕" w:hAnsi="맑은 고딕" w:eastAsia="맑은 고딕"/>
+          <w:b/>
+          <w:color w:val="13283F"/>
+          <w:sz w:val="17"/>
+        </w:rPr>
+        <w:t xml:space="preserve">  |  GitHub  </w:t>
+      </w:r>
+      <w:hyperlink r:id="rId12">
+        <w:r>
+          <w:rPr>
+            <w:rFonts w:ascii="맑은 고딕" w:hAnsi="맑은 고딕" w:eastAsia="맑은 고딕"/>
+            <w:b/>
+            <w:color w:val="159A9C"/>
+            <w:sz w:val="17"/>
+          </w:rPr>
+        </w:r>
+      </w:hyperlink>
     </w:p>
     <w:p>
       <w:pPr>
@@ -90,7 +153,7 @@
           <w:color w:val="13283F"/>
           <w:sz w:val="18"/>
         </w:rPr>
-        <w:t>사용자의 실제 업무 흐름을 이해하고 백엔드의 안정성과 AI의 활용 가능성을 하나의 서비스로 연결하는 개발자입니다. 병원 전산 운영 3년 11개월의 사용자 지원 경험을 바탕으로, Spring Boot API와 React 화면을 구현하고 FastAPI·RAG·LLM 기능을 서비스 경계 안에서 검증 가능한 형태로 연결했습니다.</w:t>
+        <w:t>사용자의 실제 업무 흐름을 이해하고 백엔드의 안정성과 AI의 활용 가능성을 하나의 서비스로 연결하는 개발자입니다. 병원 전산 운영 3년 11개월의 사용자 지원 경험을 바탕으로, Spring Boot API와 React 화면을 구현하고 FastAPI·RAG·Qwen 기능을 서비스 경계 안에서 검증 가능한 형태로 연결했습니다.</w:t>
       </w:r>
     </w:p>
     <w:p>
@@ -142,7 +205,7 @@
           <w:color w:val="13283F"/>
           <w:sz w:val="17"/>
         </w:rPr>
-        <w:t>FastAPI·BGE-M3·LLM·Spring 규칙 판정을 분리한 근거 기반 RAG 기능 설계</w:t>
+        <w:t>FastAPI·BGE-M3·Qwen·Spring 규칙 판정을 분리한 근거 기반 RAG 기능 설계</w:t>
       </w:r>
     </w:p>
     <w:p>
@@ -296,7 +359,7 @@
                 <w:color w:val="159A9C"/>
                 <w:sz w:val="17"/>
               </w:rPr>
-              <w:t>AI · Data</w:t>
+              <w:t>AI Application</w:t>
             </w:r>
           </w:p>
         </w:tc>
@@ -325,7 +388,7 @@
                 <w:color w:val="13283F"/>
                 <w:sz w:val="17"/>
               </w:rPr>
-              <w:t>Python 3.12 · FastAPI · RAG · BGE-M3 · LLM · PostgreSQL · pgvector · Redis</w:t>
+              <w:t>Python 3.12 · FastAPI · BGE-M3 · Qwen/Ollama · RAG · PyMuPDF · LangSmith</w:t>
             </w:r>
           </w:p>
         </w:tc>
@@ -357,7 +420,7 @@
                 <w:color w:val="159A9C"/>
                 <w:sz w:val="17"/>
               </w:rPr>
-              <w:t>Frontend · Test</w:t>
+              <w:t>Frontend</w:t>
             </w:r>
           </w:p>
         </w:tc>
@@ -386,7 +449,129 @@
                 <w:color w:val="13283F"/>
                 <w:sz w:val="17"/>
               </w:rPr>
-              <w:t>React 18 · Vite · Axios · JUnit 5 · pytest · Bruno · Git/GitHub</w:t>
+              <w:t>React 18 · Vite 5 · React Router · Axios · Streamlit</w:t>
+            </w:r>
+          </w:p>
+        </w:tc>
+      </w:tr>
+      <w:tr>
+        <w:tc>
+          <w:tcPr>
+            <w:tcW w:type="dxa" w:w="1701"/>
+            <w:vAlign w:val="center"/>
+            <w:shd w:fill="EAF6F5"/>
+            <w:tcMar>
+              <w:top w:w="60" w:type="dxa"/>
+              <w:start w:w="100" w:type="dxa"/>
+              <w:bottom w:w="60" w:type="dxa"/>
+              <w:end w:w="100" w:type="dxa"/>
+            </w:tcMar>
+            <w:tcBorders>
+              <w:bottom w:val="single" w:sz="4" w:color="D9E0E6"/>
+            </w:tcBorders>
+          </w:tcPr>
+          <w:p>
+            <w:pPr>
+              <w:spacing w:after="0"/>
+            </w:pPr>
+            <w:r>
+              <w:rPr>
+                <w:rFonts w:ascii="맑은 고딕" w:hAnsi="맑은 고딕" w:eastAsia="맑은 고딕"/>
+                <w:b/>
+                <w:color w:val="159A9C"/>
+                <w:sz w:val="17"/>
+              </w:rPr>
+              <w:t>Data · Infra</w:t>
+            </w:r>
+          </w:p>
+        </w:tc>
+        <w:tc>
+          <w:tcPr>
+            <w:tcW w:type="dxa" w:w="8164"/>
+            <w:vAlign w:val="center"/>
+            <w:tcMar>
+              <w:top w:w="60" w:type="dxa"/>
+              <w:start w:w="100" w:type="dxa"/>
+              <w:bottom w:w="60" w:type="dxa"/>
+              <w:end w:w="100" w:type="dxa"/>
+            </w:tcMar>
+            <w:tcBorders>
+              <w:bottom w:val="single" w:sz="4" w:color="D9E0E6"/>
+            </w:tcBorders>
+          </w:tcPr>
+          <w:p>
+            <w:pPr>
+              <w:spacing w:after="0"/>
+            </w:pPr>
+            <w:r>
+              <w:rPr>
+                <w:rFonts w:ascii="맑은 고딕" w:hAnsi="맑은 고딕" w:eastAsia="맑은 고딕"/>
+                <w:b w:val="0"/>
+                <w:color w:val="13283F"/>
+                <w:sz w:val="17"/>
+              </w:rPr>
+              <w:t>PostgreSQL · pgvector · Redis · MariaDB · Supabase · Docker(실행·검증)</w:t>
+            </w:r>
+          </w:p>
+        </w:tc>
+      </w:tr>
+      <w:tr>
+        <w:tc>
+          <w:tcPr>
+            <w:tcW w:type="dxa" w:w="1701"/>
+            <w:vAlign w:val="center"/>
+            <w:shd w:fill="EAF6F5"/>
+            <w:tcMar>
+              <w:top w:w="60" w:type="dxa"/>
+              <w:start w:w="100" w:type="dxa"/>
+              <w:bottom w:w="60" w:type="dxa"/>
+              <w:end w:w="100" w:type="dxa"/>
+            </w:tcMar>
+            <w:tcBorders>
+              <w:bottom w:val="single" w:sz="4" w:color="D9E0E6"/>
+            </w:tcBorders>
+          </w:tcPr>
+          <w:p>
+            <w:pPr>
+              <w:spacing w:after="0"/>
+            </w:pPr>
+            <w:r>
+              <w:rPr>
+                <w:rFonts w:ascii="맑은 고딕" w:hAnsi="맑은 고딕" w:eastAsia="맑은 고딕"/>
+                <w:b/>
+                <w:color w:val="159A9C"/>
+                <w:sz w:val="17"/>
+              </w:rPr>
+              <w:t>Test · Tools</w:t>
+            </w:r>
+          </w:p>
+        </w:tc>
+        <w:tc>
+          <w:tcPr>
+            <w:tcW w:type="dxa" w:w="8164"/>
+            <w:vAlign w:val="center"/>
+            <w:tcMar>
+              <w:top w:w="60" w:type="dxa"/>
+              <w:start w:w="100" w:type="dxa"/>
+              <w:bottom w:w="60" w:type="dxa"/>
+              <w:end w:w="100" w:type="dxa"/>
+            </w:tcMar>
+            <w:tcBorders>
+              <w:bottom w:val="single" w:sz="4" w:color="D9E0E6"/>
+            </w:tcBorders>
+          </w:tcPr>
+          <w:p>
+            <w:pPr>
+              <w:spacing w:after="0"/>
+            </w:pPr>
+            <w:r>
+              <w:rPr>
+                <w:rFonts w:ascii="맑은 고딕" w:hAnsi="맑은 고딕" w:eastAsia="맑은 고딕"/>
+                <w:b w:val="0"/>
+                <w:color w:val="13283F"/>
+                <w:sz w:val="17"/>
+              </w:rPr>
+              <w:t>JUnit 5 · pytest · Bruno · Git/GitHub</w:t>
             </w:r>
           </w:p>
         </w:tc>
@@ -532,6 +717,44 @@
           <w:color w:val="13283F"/>
           <w:sz w:val="20"/>
         </w:rPr>
+        <w:t>휴먼AI교육센터 · 심화_인공지능(AI) 서비스 기반 웹 개발자 심화 프로젝트</w:t>
+      </w:r>
+      <w:r>
+        <w:rPr>
+          <w:rFonts w:ascii="맑은 고딕" w:hAnsi="맑은 고딕" w:eastAsia="맑은 고딕"/>
+          <w:b w:val="0"/>
+          <w:color w:val="5C6670"/>
+          <w:sz w:val="16"/>
+        </w:rPr>
+        <w:t xml:space="preserve">  |  2026.06.11 – 2026.08.11</w:t>
+      </w:r>
+    </w:p>
+    <w:p>
+      <w:pPr>
+        <w:spacing w:after="50" w:line="271" w:lineRule="auto"/>
+      </w:pPr>
+      <w:r>
+        <w:rPr>
+          <w:rFonts w:ascii="맑은 고딕" w:hAnsi="맑은 고딕" w:eastAsia="맑은 고딕"/>
+          <w:b w:val="0"/>
+          <w:color w:val="13283F"/>
+          <w:sz w:val="17"/>
+        </w:rPr>
+        <w:t>머신러닝·딥러닝·LLM 응용 기능과 Spring Boot·FastAPI 기반 웹 서비스를 단계별 프로젝트로 구현</w:t>
+      </w:r>
+    </w:p>
+    <w:p>
+      <w:pPr>
+        <w:keepNext/>
+        <w:spacing w:before="70" w:after="28"/>
+      </w:pPr>
+      <w:r>
+        <w:rPr>
+          <w:rFonts w:ascii="맑은 고딕" w:hAnsi="맑은 고딕" w:eastAsia="맑은 고딕"/>
+          <w:b/>
+          <w:color w:val="13283F"/>
+          <w:sz w:val="20"/>
+        </w:rPr>
         <w:t>KG IT BANK · 핀테크 서비스를 위한 풀스택 개발자 양성 과정</w:t>
       </w:r>
       <w:r>
@@ -541,7 +764,7 @@
           <w:color w:val="5C6670"/>
           <w:sz w:val="16"/>
         </w:rPr>
-        <w:t xml:space="preserve">  |  2024.08 – 2025.02</w:t>
+        <w:t xml:space="preserve">  |  2024.08.05 – 2025.02.13</w:t>
       </w:r>
     </w:p>
     <w:p>
@@ -617,7 +840,7 @@
           <w:color w:val="13283F"/>
           <w:sz w:val="20"/>
         </w:rPr>
-        <w:t>BidMatch · AI 기반 공공입찰 맞춤 추천·자격진단 서비스</w:t>
+        <w:t>BidMatch · AI 기반 공공입찰 맞춤 추천·자가 자격 진단 서비스</w:t>
       </w:r>
       <w:r>
         <w:rPr>
@@ -626,7 +849,7 @@
           <w:color w:val="5C6670"/>
           <w:sz w:val="16"/>
         </w:rPr>
-        <w:t xml:space="preserve">  |  2026.07.15 – 2026.08.05 · 5인 팀 PL</w:t>
+        <w:t xml:space="preserve">  |  2026.07.09 – 2026.08.07 · 5인 팀 PL</w:t>
       </w:r>
     </w:p>
     <w:p>
@@ -640,7 +863,7 @@
           <w:color w:val="5C6670"/>
           <w:sz w:val="17"/>
         </w:rPr>
-        <w:t>나라장터 공고와 기업정보를 연결해 맞춤 공고 추천, 근거 기반 자가 자격진단, 알림과 고객센터를 제공하는 서비스</w:t>
+        <w:t>나라장터 공고와 기업정보를 연결해 맞춤 공고 추천, 근거 기반 자가 자격 진단, 알림과 고객센터를 제공하는 서비스</w:t>
       </w:r>
     </w:p>
     <w:p>
@@ -708,7 +931,7 @@
           <w:color w:val="13283F"/>
           <w:sz w:val="17"/>
         </w:rPr>
-        <w:t>BGE-M3 근거 검색, LLM 유형 분류, Spring 규칙 판정을 결합해 AI가 최종 자격 판정을 독점하지 않도록 설계</w:t>
+        <w:t>BGE-M3 근거 검색과 Qwen 유형 분류 결과를 Spring 규칙 판정으로 재검증하는 자가 자격 진단 구조 설계</w:t>
       </w:r>
     </w:p>
     <w:p>
@@ -742,7 +965,7 @@
           <w:color w:val="13283F"/>
           <w:sz w:val="17"/>
         </w:rPr>
-        <w:t>5개 저장소 118개 비병합 커밋 기여, AI pytest 242건 및 Backend·Frontend 최종 빌드/테스트 통과</w:t>
+        <w:t>5개 저장소 118개 비병합 커밋 기여, AI pytest 242건, Backend 테스트, 사용자·관리자 Frontend 빌드 통과</w:t>
       </w:r>
     </w:p>
     <w:p>
@@ -756,7 +979,7 @@
           <w:color w:val="159A9C"/>
           <w:sz w:val="16"/>
         </w:rPr>
-        <w:t>기술: Spring Boot · FastAPI · React · PostgreSQL · Redis · BGE-M3 · RAG · LLM · Flyway</w:t>
+        <w:t>기술: Spring Boot · FastAPI · React · PostgreSQL · Redis · BGE-M3 · Qwen/Ollama · RAG · PyMuPDF · Flyway · Docker(실행·검증)</w:t>
       </w:r>
     </w:p>
     <w:p>
@@ -780,7 +1003,7 @@
           <w:color w:val="5C6670"/>
           <w:sz w:val="16"/>
         </w:rPr>
-        <w:t xml:space="preserve">  |  2026.07.04 – 2026.07.07 · 개인</w:t>
+        <w:t xml:space="preserve">  |  2026.07.02 – 2026.07.07 · 개인</w:t>
       </w:r>
     </w:p>
     <w:p>
@@ -838,7 +1061,7 @@
           <w:color w:val="5C6670"/>
           <w:sz w:val="16"/>
         </w:rPr>
-        <w:t xml:space="preserve">  |  2026.06.21 – 2026.07.01 · 개인</w:t>
+        <w:t xml:space="preserve">  |  2026.06.25 – 2026.07.01 · 개인</w:t>
       </w:r>
     </w:p>
     <w:p>
@@ -896,7 +1119,7 @@
           <w:color w:val="5C6670"/>
           <w:sz w:val="16"/>
         </w:rPr>
-        <w:t xml:space="preserve">  |  2026.06.21 – 2026.06.24 · 개인</w:t>
+        <w:t xml:space="preserve">  |  2026.06.18 – 2026.06.24 · 개인</w:t>
       </w:r>
     </w:p>
     <w:p>
@@ -930,7 +1153,7 @@
           <w:color w:val="13283F"/>
           <w:sz w:val="17"/>
         </w:rPr>
-        <w:t>전처리·모델을 scikit-learn Pipeline으로 패키징해 Streamlit에 연결, Recall 65%·ROC-AUC 0.785 기록</w:t>
+        <w:t>전처리·모델을 scikit-learn Pipeline으로 패키징해 Streamlit에 연결, 프로젝트 보고서 기준 Recall 65%·ROC-AUC 0.785 기록</w:t>
       </w:r>
     </w:p>
     <w:p>
@@ -954,7 +1177,7 @@
           <w:color w:val="5C6670"/>
           <w:sz w:val="16"/>
         </w:rPr>
-        <w:t xml:space="preserve">  |  2026.06.14 – 2026.06.20 · 팀 PL</w:t>
+        <w:t xml:space="preserve">  |  2026.06.11 – 2026.06.17 · 팀 PL</w:t>
       </w:r>
     </w:p>
     <w:p>
@@ -1083,7 +1306,31 @@
     </w:p>
     <w:p>
       <w:pPr>
-        <w:spacing w:after="16" w:line="271" w:lineRule="auto"/>
+        <w:spacing w:after="16" w:line="259" w:lineRule="auto"/>
+      </w:pPr>
+      <w:r>
+        <w:rPr>
+          <w:rFonts w:ascii="맑은 고딕" w:hAnsi="맑은 고딕" w:eastAsia="맑은 고딕"/>
+          <w:b/>
+          <w:color w:val="13283F"/>
+          <w:sz w:val="17"/>
+        </w:rPr>
+        <w:t>Portfolio</w:t>
+      </w:r>
+      <w:hyperlink r:id="rId11">
+        <w:r>
+          <w:rPr>
+            <w:rFonts w:ascii="맑은 고딕" w:hAnsi="맑은 고딕" w:eastAsia="맑은 고딕"/>
+            <w:b w:val="0"/>
+            <w:color w:val="13283F"/>
+            <w:sz w:val="17"/>
+          </w:rPr>
+        </w:r>
+      </w:hyperlink>
+    </w:p>
+    <w:p>
+      <w:pPr>
+        <w:spacing w:after="16" w:line="259" w:lineRule="auto"/>
       </w:pPr>
       <w:r>
         <w:rPr>
@@ -1094,19 +1341,20 @@
         </w:rPr>
         <w:t>GitHub</w:t>
       </w:r>
-      <w:r>
-        <w:rPr>
-          <w:rFonts w:ascii="맑은 고딕" w:hAnsi="맑은 고딕" w:eastAsia="맑은 고딕"/>
-          <w:b w:val="0"/>
-          <w:color w:val="13283F"/>
-          <w:sz w:val="17"/>
-        </w:rPr>
-        <w:t xml:space="preserve">  https://github.com/kjongrok</w:t>
-      </w:r>
+      <w:hyperlink r:id="rId12">
+        <w:r>
+          <w:rPr>
+            <w:rFonts w:ascii="맑은 고딕" w:hAnsi="맑은 고딕" w:eastAsia="맑은 고딕"/>
+            <w:b w:val="0"/>
+            <w:color w:val="13283F"/>
+            <w:sz w:val="17"/>
+          </w:rPr>
+        </w:r>
+      </w:hyperlink>
     </w:p>
     <w:p>
       <w:pPr>
-        <w:spacing w:after="16" w:line="271" w:lineRule="auto"/>
+        <w:spacing w:after="16" w:line="259" w:lineRule="auto"/>
       </w:pPr>
       <w:r>
         <w:rPr>
@@ -1115,21 +1363,22 @@
           <w:color w:val="13283F"/>
           <w:sz w:val="17"/>
         </w:rPr>
-        <w:t>BidMatch Backend</w:t>
+        <w:t>BidMatch Project</w:t>
       </w:r>
-      <w:r>
-        <w:rPr>
-          <w:rFonts w:ascii="맑은 고딕" w:hAnsi="맑은 고딕" w:eastAsia="맑은 고딕"/>
-          <w:b w:val="0"/>
-          <w:color w:val="13283F"/>
-          <w:sz w:val="17"/>
-        </w:rPr>
-        <w:t xml:space="preserve">  https://github.com/aiHuman1Team/back-end</w:t>
-      </w:r>
+      <w:hyperlink r:id="rId13">
+        <w:r>
+          <w:rPr>
+            <w:rFonts w:ascii="맑은 고딕" w:hAnsi="맑은 고딕" w:eastAsia="맑은 고딕"/>
+            <w:b w:val="0"/>
+            <w:color w:val="13283F"/>
+            <w:sz w:val="17"/>
+          </w:rPr>
+        </w:r>
+      </w:hyperlink>
     </w:p>
     <w:p>
       <w:pPr>
-        <w:spacing w:after="16" w:line="271" w:lineRule="auto"/>
+        <w:spacing w:after="16" w:line="259" w:lineRule="auto"/>
       </w:pPr>
       <w:r>
         <w:rPr>
@@ -1138,43 +1387,21 @@
           <w:color w:val="13283F"/>
           <w:sz w:val="17"/>
         </w:rPr>
-        <w:t>BidMatch AI</w:t>
+        <w:t>BidMatch Service</w:t>
       </w:r>
-      <w:r>
-        <w:rPr>
-          <w:rFonts w:ascii="맑은 고딕" w:hAnsi="맑은 고딕" w:eastAsia="맑은 고딕"/>
-          <w:b w:val="0"/>
-          <w:color w:val="13283F"/>
-          <w:sz w:val="17"/>
-        </w:rPr>
-        <w:t xml:space="preserve">  https://github.com/aiHuman1Team/ai</w:t>
-      </w:r>
-    </w:p>
-    <w:p>
-      <w:pPr>
-        <w:spacing w:after="16" w:line="271" w:lineRule="auto"/>
-      </w:pPr>
-      <w:r>
-        <w:rPr>
-          <w:rFonts w:ascii="맑은 고딕" w:hAnsi="맑은 고딕" w:eastAsia="맑은 고딕"/>
-          <w:b/>
-          <w:color w:val="13283F"/>
-          <w:sz w:val="17"/>
-        </w:rPr>
-        <w:t>BidMatch Frontend</w:t>
-      </w:r>
-      <w:r>
-        <w:rPr>
-          <w:rFonts w:ascii="맑은 고딕" w:hAnsi="맑은 고딕" w:eastAsia="맑은 고딕"/>
-          <w:b w:val="0"/>
-          <w:color w:val="13283F"/>
-          <w:sz w:val="17"/>
-        </w:rPr>
-        <w:t xml:space="preserve">  https://github.com/aiHuman1Team/front-end</w:t>
-      </w:r>
+      <w:hyperlink r:id="rId14">
+        <w:r>
+          <w:rPr>
+            <w:rFonts w:ascii="맑은 고딕" w:hAnsi="맑은 고딕" w:eastAsia="맑은 고딕"/>
+            <w:b w:val="0"/>
+            <w:color w:val="13283F"/>
+            <w:sz w:val="17"/>
+          </w:rPr>
+        </w:r>
+      </w:hyperlink>
     </w:p>
     <w:sectPr>
-      <w:footerReference w:type="default" r:id="rId9"/>
+      <w:footerReference w:type="default" r:id="rId15"/>
       <w:pgSz w:w="11906" w:h="16838"/>
       <w:pgMar w:top="765" w:right="879" w:bottom="709" w:left="879" w:header="283" w:footer="283" w:gutter="0"/>
       <w:cols w:space="720"/>

</xml_diff>

<commit_message>
docs: update resume and handoff materials
</commit_message>
<xml_diff>
--- a/output/김종록_백엔드_AI응용개발자_이력서.docx
+++ b/output/김종록_백엔드_AI응용개발자_이력서.docx
@@ -75,49 +75,6 @@
     </w:p>
     <w:p>
       <w:pPr>
-        <w:spacing w:after="140" w:line="240" w:lineRule="auto"/>
-      </w:pPr>
-      <w:r>
-        <w:rPr>
-          <w:rFonts w:ascii="맑은 고딕" w:hAnsi="맑은 고딕" w:eastAsia="맑은 고딕"/>
-          <w:b/>
-          <w:color w:val="13283F"/>
-          <w:sz w:val="17"/>
-        </w:rPr>
-        <w:t xml:space="preserve">Portfolio  </w:t>
-      </w:r>
-      <w:hyperlink r:id="rId11">
-        <w:r>
-          <w:rPr>
-            <w:rFonts w:ascii="맑은 고딕" w:hAnsi="맑은 고딕" w:eastAsia="맑은 고딕"/>
-            <w:b/>
-            <w:color w:val="159A9C"/>
-            <w:sz w:val="17"/>
-          </w:rPr>
-        </w:r>
-      </w:hyperlink>
-      <w:r>
-        <w:rPr>
-          <w:rFonts w:ascii="맑은 고딕" w:hAnsi="맑은 고딕" w:eastAsia="맑은 고딕"/>
-          <w:b/>
-          <w:color w:val="13283F"/>
-          <w:sz w:val="17"/>
-        </w:rPr>
-        <w:t xml:space="preserve">  |  GitHub  </w:t>
-      </w:r>
-      <w:hyperlink r:id="rId12">
-        <w:r>
-          <w:rPr>
-            <w:rFonts w:ascii="맑은 고딕" w:hAnsi="맑은 고딕" w:eastAsia="맑은 고딕"/>
-            <w:b/>
-            <w:color w:val="159A9C"/>
-            <w:sz w:val="17"/>
-          </w:rPr>
-        </w:r>
-      </w:hyperlink>
-    </w:p>
-    <w:p>
-      <w:pPr>
         <w:spacing w:after="120"/>
         <w:pBdr>
           <w:bottom w:val="single" w:sz="16" w:space="1" w:color="159A9C"/>
@@ -144,7 +101,7 @@
     </w:p>
     <w:p>
       <w:pPr>
-        <w:spacing w:after="70" w:line="271" w:lineRule="auto"/>
+        <w:spacing w:after="44" w:line="271" w:lineRule="auto"/>
       </w:pPr>
       <w:r>
         <w:rPr>
@@ -153,8 +110,108 @@
           <w:color w:val="13283F"/>
           <w:sz w:val="18"/>
         </w:rPr>
-        <w:t>사용자의 실제 업무 흐름을 이해하고 백엔드의 안정성과 AI의 활용 가능성을 하나의 서비스로 연결하는 개발자입니다. 병원 전산 운영 3년 11개월의 사용자 지원 경험을 바탕으로, Spring Boot API와 React 화면을 구현하고 FastAPI·RAG·Qwen 기능을 서비스 경계 안에서 검증 가능한 형태로 연결했습니다.</w:t>
+        <w:t>병원 전산 운영 3년 11개월 동안 여러 진료·행정부서의 장애에 대응하고 사용자 요청을 처리하며, 문제를 단순 증상이 아닌 업무 흐름과 시스템 구조의 관점에서 파악하는 경험을 쌓았습니다.</w:t>
       </w:r>
+    </w:p>
+    <w:p>
+      <w:pPr>
+        <w:spacing w:after="44" w:line="271" w:lineRule="auto"/>
+      </w:pPr>
+      <w:r>
+        <w:rPr>
+          <w:rFonts w:ascii="맑은 고딕" w:hAnsi="맑은 고딕" w:eastAsia="맑은 고딕"/>
+          <w:b w:val="0"/>
+          <w:color w:val="13283F"/>
+          <w:sz w:val="18"/>
+        </w:rPr>
+        <w:t>이후 Spring Boot 기반 Backend와 React 화면을 구현하고, 머신러닝·딥러닝 모델 개발과 LLM 에이전트·RAG 챗봇 구현을 경험했습니다. 5인 팀 PL로 참여한 BidMatch에서는 FastAPI AI 기능을 Backend 규칙, 응답 검증과 대체 처리로 보완하고 AI 자동화 테스트 242건을 통과했습니다.</w:t>
+      </w:r>
+    </w:p>
+    <w:p>
+      <w:pPr>
+        <w:spacing w:after="40" w:line="271" w:lineRule="auto"/>
+      </w:pPr>
+      <w:r>
+        <w:rPr>
+          <w:rFonts w:ascii="맑은 고딕" w:hAnsi="맑은 고딕" w:eastAsia="맑은 고딕"/>
+          <w:b w:val="0"/>
+          <w:color w:val="13283F"/>
+          <w:sz w:val="18"/>
+        </w:rPr>
+        <w:t>운영 환경에 대한 이해를 바탕으로 AI 기능을 안정적인 Backend 서비스에 연결하고, 예외 상황에서도 사용자가 신뢰할 수 있는 결과를 제공하는 개발자로 성장하고 있습니다.</w:t>
+      </w:r>
+    </w:p>
+    <w:p>
+      <w:pPr>
+        <w:spacing w:after="80" w:line="240" w:lineRule="auto"/>
+      </w:pPr>
+      <w:hyperlink r:id="rId11">
+        <w:r>
+          <w:rPr>
+            <w:rFonts w:ascii="맑은 고딕" w:hAnsi="맑은 고딕" w:eastAsia="맑은 고딕"/>
+            <w:b/>
+            <w:color w:val="159A9C"/>
+            <w:sz w:val="17"/>
+          </w:rPr>
+        </w:r>
+      </w:hyperlink>
+      <w:r>
+        <w:rPr>
+          <w:rFonts w:ascii="맑은 고딕" w:hAnsi="맑은 고딕" w:eastAsia="맑은 고딕"/>
+          <w:b w:val="0"/>
+          <w:color w:val="5C6670"/>
+          <w:sz w:val="17"/>
+        </w:rPr>
+        <w:t xml:space="preserve">  |  </w:t>
+      </w:r>
+      <w:hyperlink r:id="rId12">
+        <w:r>
+          <w:rPr>
+            <w:rFonts w:ascii="맑은 고딕" w:hAnsi="맑은 고딕" w:eastAsia="맑은 고딕"/>
+            <w:b/>
+            <w:color w:val="159A9C"/>
+            <w:sz w:val="17"/>
+          </w:rPr>
+        </w:r>
+      </w:hyperlink>
+      <w:r>
+        <w:rPr>
+          <w:rFonts w:ascii="맑은 고딕" w:hAnsi="맑은 고딕" w:eastAsia="맑은 고딕"/>
+          <w:b w:val="0"/>
+          <w:color w:val="5C6670"/>
+          <w:sz w:val="17"/>
+        </w:rPr>
+        <w:t xml:space="preserve">  |  </w:t>
+      </w:r>
+      <w:hyperlink r:id="rId13">
+        <w:r>
+          <w:rPr>
+            <w:rFonts w:ascii="맑은 고딕" w:hAnsi="맑은 고딕" w:eastAsia="맑은 고딕"/>
+            <w:b/>
+            <w:color w:val="159A9C"/>
+            <w:sz w:val="17"/>
+          </w:rPr>
+        </w:r>
+      </w:hyperlink>
+      <w:r>
+        <w:rPr>
+          <w:rFonts w:ascii="맑은 고딕" w:hAnsi="맑은 고딕" w:eastAsia="맑은 고딕"/>
+          <w:b w:val="0"/>
+          <w:color w:val="5C6670"/>
+          <w:sz w:val="17"/>
+        </w:rPr>
+        <w:t xml:space="preserve">  |  </w:t>
+      </w:r>
+      <w:hyperlink r:id="rId14">
+        <w:r>
+          <w:rPr>
+            <w:rFonts w:ascii="맑은 고딕" w:hAnsi="맑은 고딕" w:eastAsia="맑은 고딕"/>
+            <w:b/>
+            <w:color w:val="159A9C"/>
+            <w:sz w:val="17"/>
+          </w:rPr>
+        </w:r>
+      </w:hyperlink>
     </w:p>
     <w:p>
       <w:pPr>
@@ -205,7 +262,7 @@
           <w:color w:val="13283F"/>
           <w:sz w:val="17"/>
         </w:rPr>
-        <w:t>FastAPI·BGE-M3·Qwen·Spring 규칙 판정을 분리한 근거 기반 RAG 기능 설계</w:t>
+        <w:t>정형 데이터 ML, 영상·시계열 DL 모델 개발과 LLM 에이전트·RAG 챗봇 구현</w:t>
       </w:r>
     </w:p>
     <w:p>
@@ -222,7 +279,7 @@
           <w:color w:val="13283F"/>
           <w:sz w:val="17"/>
         </w:rPr>
-        <w:t>Flyway 충돌, 외부 API 장애, 비정상 AI 출력에 대한 검증, fallback과 상태 관리 적용</w:t>
+        <w:t>BGE-M3 검색·Qwen 분류와 Spring 규칙 판정을 분리하고 검증·fallback 적용</w:t>
       </w:r>
     </w:p>
     <w:p>
@@ -327,7 +384,7 @@
                 <w:color w:val="13283F"/>
                 <w:sz w:val="17"/>
               </w:rPr>
-              <w:t>Java 17 · Spring Boot 3.5 · Spring Security · Spring Data JPA · Flyway · SSE</w:t>
+              <w:t>Java 17 · Spring Boot 3.5 · Spring Security · Spring Data JPA · MyBatis · SSE</w:t>
             </w:r>
           </w:p>
         </w:tc>
@@ -359,7 +416,7 @@
                 <w:color w:val="159A9C"/>
                 <w:sz w:val="17"/>
               </w:rPr>
-              <w:t>AI Application</w:t>
+              <w:t>AI · ML/DL</w:t>
             </w:r>
           </w:p>
         </w:tc>
@@ -388,7 +445,7 @@
                 <w:color w:val="13283F"/>
                 <w:sz w:val="17"/>
               </w:rPr>
-              <w:t>Python 3.12 · FastAPI · BGE-M3 · Qwen/Ollama · RAG · PyMuPDF · LangSmith</w:t>
+              <w:t>Python 3.12 · FastAPI · scikit-learn · TensorFlow/Keras · PyTorch · YOLOv8 · RAG · BGE-M3 · Qwen/Ollama</w:t>
             </w:r>
           </w:p>
         </w:tc>
@@ -542,7 +599,7 @@
                 <w:color w:val="159A9C"/>
                 <w:sz w:val="17"/>
               </w:rPr>
-              <w:t>Test · Tools</w:t>
+              <w:t>Test · Collaboration</w:t>
             </w:r>
           </w:p>
         </w:tc>
@@ -571,7 +628,7 @@
                 <w:color w:val="13283F"/>
                 <w:sz w:val="17"/>
               </w:rPr>
-              <w:t>JUnit 5 · pytest · Bruno · Git/GitHub</w:t>
+              <w:t>JUnit 5 · pytest · Bruno · Git/GitHub · GitHub Actions · Jira · Slack</w:t>
             </w:r>
           </w:p>
         </w:tc>
@@ -621,19 +678,16 @@
     </w:p>
     <w:p>
       <w:pPr>
-        <w:pStyle w:val="ListBullet"/>
-        <w:keepLines/>
-        <w:spacing w:after="24" w:line="259" w:lineRule="auto"/>
-        <w:ind w:left="255" w:hanging="125"/>
+        <w:spacing w:after="10" w:line="271" w:lineRule="auto"/>
       </w:pPr>
       <w:r>
         <w:rPr>
           <w:rFonts w:ascii="맑은 고딕" w:hAnsi="맑은 고딕" w:eastAsia="맑은 고딕"/>
           <w:b w:val="0"/>
-          <w:color w:val="13283F"/>
+          <w:color w:val="159A9C"/>
           <w:sz w:val="17"/>
         </w:rPr>
-        <w:t>30개 이상 부서의 OA 시스템 요구사항을 수집하고 하드웨어·소프트웨어 구성 검토와 도입 지원</w:t>
+        <w:t>담당 업무</w:t>
       </w:r>
     </w:p>
     <w:p>
@@ -650,7 +704,7 @@
           <w:color w:val="13283F"/>
           <w:sz w:val="17"/>
         </w:rPr>
-        <w:t>연간 300건 이상의 장애·사용자 요청을 처리하고 운영 매뉴얼, 정책, Q&amp;A 대응 체계 정리</w:t>
+        <w:t>병원 내 여러 진료·행정부서의 OA 요구사항 수집, 시스템 구성 검토와 도입 지원</w:t>
       </w:r>
     </w:p>
     <w:p>
@@ -667,7 +721,21 @@
           <w:color w:val="13283F"/>
           <w:sz w:val="17"/>
         </w:rPr>
-        <w:t>신규 시스템 도입과 개편 과정에서 비IT 직군 대상 교육 자료를 제작하고 40회 이상 교육 진행</w:t>
+        <w:t>장애·사용자 요청 대응, 신규 시스템 교육 자료 제작과 사용자 교육 진행</w:t>
+      </w:r>
+    </w:p>
+    <w:p>
+      <w:pPr>
+        <w:spacing w:after="10" w:line="271" w:lineRule="auto"/>
+      </w:pPr>
+      <w:r>
+        <w:rPr>
+          <w:rFonts w:ascii="맑은 고딕" w:hAnsi="맑은 고딕" w:eastAsia="맑은 고딕"/>
+          <w:b w:val="0"/>
+          <w:color w:val="159A9C"/>
+          <w:sz w:val="17"/>
+        </w:rPr>
+        <w:t>경험 및 직무 연결점</w:t>
       </w:r>
     </w:p>
     <w:p>
@@ -684,7 +752,24 @@
           <w:color w:val="13283F"/>
           <w:sz w:val="17"/>
         </w:rPr>
-        <w:t>코로나19 기간 전자결재·원격 OA 접근 체계 전환 과정에서 사용자 안내와 장애 대응 지원</w:t>
+        <w:t>반복 문의를 운영 매뉴얼·정책·Q&amp;A 대응 체계로 정리하고 원격 OA 전환 지원</w:t>
+      </w:r>
+    </w:p>
+    <w:p>
+      <w:pPr>
+        <w:pStyle w:val="ListBullet"/>
+        <w:keepLines/>
+        <w:spacing w:after="24" w:line="259" w:lineRule="auto"/>
+        <w:ind w:left="255" w:hanging="125"/>
+      </w:pPr>
+      <w:r>
+        <w:rPr>
+          <w:rFonts w:ascii="맑은 고딕" w:hAnsi="맑은 고딕" w:eastAsia="맑은 고딕"/>
+          <w:b w:val="0"/>
+          <w:color w:val="13283F"/>
+          <w:sz w:val="17"/>
+        </w:rPr>
+        <w:t>사용자 업무와 영향 범위를 고려해 원인을 좁히는 경험을 개발의 예외 처리·운영 관점으로 확장</w:t>
       </w:r>
     </w:p>
     <w:p>
@@ -731,20 +816,6 @@
     </w:p>
     <w:p>
       <w:pPr>
-        <w:spacing w:after="50" w:line="271" w:lineRule="auto"/>
-      </w:pPr>
-      <w:r>
-        <w:rPr>
-          <w:rFonts w:ascii="맑은 고딕" w:hAnsi="맑은 고딕" w:eastAsia="맑은 고딕"/>
-          <w:b w:val="0"/>
-          <w:color w:val="13283F"/>
-          <w:sz w:val="17"/>
-        </w:rPr>
-        <w:t>머신러닝·딥러닝·LLM 응용 기능과 Spring Boot·FastAPI 기반 웹 서비스를 단계별 프로젝트로 구현</w:t>
-      </w:r>
-    </w:p>
-    <w:p>
-      <w:pPr>
         <w:keepNext/>
         <w:spacing w:before="70" w:after="28"/>
       </w:pPr>
@@ -765,20 +836,6 @@
           <w:sz w:val="16"/>
         </w:rPr>
         <w:t xml:space="preserve">  |  2024.08.05 – 2025.02.13</w:t>
-      </w:r>
-    </w:p>
-    <w:p>
-      <w:pPr>
-        <w:spacing w:after="50" w:line="271" w:lineRule="auto"/>
-      </w:pPr>
-      <w:r>
-        <w:rPr>
-          <w:rFonts w:ascii="맑은 고딕" w:hAnsi="맑은 고딕" w:eastAsia="맑은 고딕"/>
-          <w:b w:val="0"/>
-          <w:color w:val="13283F"/>
-          <w:sz w:val="17"/>
-        </w:rPr>
-        <w:t>Java, Spring Boot, SQL, JavaScript 기반 웹 서비스 설계와 팀 프로젝트 수행</w:t>
       </w:r>
     </w:p>
     <w:p>
@@ -808,6 +865,92 @@
     <w:p>
       <w:r>
         <w:br w:type="page"/>
+      </w:r>
+    </w:p>
+    <w:p>
+      <w:pPr>
+        <w:keepNext/>
+        <w:spacing w:before="120" w:after="70"/>
+        <w:pBdr>
+          <w:bottom w:val="single" w:sz="7" w:space="2" w:color="D9E0E6"/>
+        </w:pBdr>
+      </w:pPr>
+      <w:r>
+        <w:rPr>
+          <w:rFonts w:ascii="맑은 고딕" w:hAnsi="맑은 고딕" w:eastAsia="맑은 고딕"/>
+          <w:b/>
+          <w:color w:val="13283F"/>
+          <w:sz w:val="22"/>
+        </w:rPr>
+        <w:t>AI EDUCATION HIGHLIGHTS</w:t>
+      </w:r>
+    </w:p>
+    <w:p>
+      <w:pPr>
+        <w:pStyle w:val="ListBullet"/>
+        <w:keepLines/>
+        <w:spacing w:after="24" w:line="259" w:lineRule="auto"/>
+        <w:ind w:left="255" w:hanging="125"/>
+      </w:pPr>
+      <w:r>
+        <w:rPr>
+          <w:rFonts w:ascii="맑은 고딕" w:hAnsi="맑은 고딕" w:eastAsia="맑은 고딕"/>
+          <w:b w:val="0"/>
+          <w:color w:val="13283F"/>
+          <w:sz w:val="17"/>
+        </w:rPr>
+        <w:t>scikit-learn 기반 데이터 전처리·모델 비교와 불균형 데이터 평가</w:t>
+      </w:r>
+    </w:p>
+    <w:p>
+      <w:pPr>
+        <w:pStyle w:val="ListBullet"/>
+        <w:keepLines/>
+        <w:spacing w:after="24" w:line="259" w:lineRule="auto"/>
+        <w:ind w:left="255" w:hanging="125"/>
+      </w:pPr>
+      <w:r>
+        <w:rPr>
+          <w:rFonts w:ascii="맑은 고딕" w:hAnsi="맑은 고딕" w:eastAsia="맑은 고딕"/>
+          <w:b w:val="0"/>
+          <w:color w:val="13283F"/>
+          <w:sz w:val="17"/>
+        </w:rPr>
+        <w:t>YOLOv8·LSTM 기반 객체 탐지, 이상탐지와 시계열 예측 모델 개발</w:t>
+      </w:r>
+    </w:p>
+    <w:p>
+      <w:pPr>
+        <w:pStyle w:val="ListBullet"/>
+        <w:keepLines/>
+        <w:spacing w:after="24" w:line="259" w:lineRule="auto"/>
+        <w:ind w:left="255" w:hanging="125"/>
+      </w:pPr>
+      <w:r>
+        <w:rPr>
+          <w:rFonts w:ascii="맑은 고딕" w:hAnsi="맑은 고딕" w:eastAsia="맑은 고딕"/>
+          <w:b w:val="0"/>
+          <w:color w:val="13283F"/>
+          <w:sz w:val="17"/>
+        </w:rPr>
+        <w:t>LLM Function Calling·RAG 챗봇과 응답 검증·fallback 구현</w:t>
+      </w:r>
+    </w:p>
+    <w:p>
+      <w:pPr>
+        <w:pStyle w:val="ListBullet"/>
+        <w:keepLines/>
+        <w:spacing w:after="24" w:line="259" w:lineRule="auto"/>
+        <w:ind w:left="255" w:hanging="125"/>
+      </w:pPr>
+      <w:r>
+        <w:rPr>
+          <w:rFonts w:ascii="맑은 고딕" w:hAnsi="맑은 고딕" w:eastAsia="맑은 고딕"/>
+          <w:b w:val="0"/>
+          <w:color w:val="13283F"/>
+          <w:sz w:val="17"/>
+        </w:rPr>
+        <w:t>Spring Boot·FastAPI·React 기반 Backend·AI·사용자 화면 연동</w:t>
       </w:r>
     </w:p>
     <w:p>
@@ -948,7 +1091,7 @@
           <w:color w:val="13283F"/>
           <w:sz w:val="17"/>
         </w:rPr>
-        <w:t>병렬 개발 중 Flyway 버전·체크섬·레거시 스키마 충돌을 적용 이력을 보존하는 후속 마이그레이션으로 해결</w:t>
+        <w:t>병렬 개발 중 DB 마이그레이션(Flyway) 버전·체크섬·스키마 충돌을 기존 이력을 보존한 후속 마이그레이션으로 해결</w:t>
       </w:r>
     </w:p>
     <w:p>
@@ -965,7 +1108,7 @@
           <w:color w:val="13283F"/>
           <w:sz w:val="17"/>
         </w:rPr>
-        <w:t>5개 저장소 118개 비병합 커밋 기여, AI pytest 242건, Backend 테스트, 사용자·관리자 Frontend 빌드 통과</w:t>
+        <w:t>5개 저장소 118개 비병합 커밋 기여, AI 자동화 테스트 242건, Backend 테스트, 사용자·관리자 Frontend 빌드 통과</w:t>
       </w:r>
     </w:p>
     <w:p>
@@ -979,7 +1122,7 @@
           <w:color w:val="159A9C"/>
           <w:sz w:val="16"/>
         </w:rPr>
-        <w:t>기술: Spring Boot · FastAPI · React · PostgreSQL · Redis · BGE-M3 · Qwen/Ollama · RAG · PyMuPDF · Flyway · Docker(실행·검증)</w:t>
+        <w:t>기술: Spring Boot · FastAPI · React · PostgreSQL · Redis · BGE-M3 · Qwen/Ollama · RAG · PyMuPDF · Docker(실행·검증)</w:t>
       </w:r>
     </w:p>
     <w:p>
@@ -1042,6 +1185,20 @@
     </w:p>
     <w:p>
       <w:pPr>
+        <w:spacing w:after="20" w:line="271" w:lineRule="auto"/>
+      </w:pPr>
+      <w:r>
+        <w:rPr>
+          <w:rFonts w:ascii="맑은 고딕" w:hAnsi="맑은 고딕" w:eastAsia="맑은 고딕"/>
+          <w:b w:val="0"/>
+          <w:color w:val="159A9C"/>
+          <w:sz w:val="16"/>
+        </w:rPr>
+        <w:t>기술: Python · YOLOv8 · Supabase · LLM Function Calling · Streamlit · python-docx</w:t>
+      </w:r>
+    </w:p>
+    <w:p>
+      <w:pPr>
         <w:keepNext/>
         <w:spacing w:before="70" w:after="28"/>
       </w:pPr>
@@ -1096,6 +1253,20 @@
           <w:sz w:val="17"/>
         </w:rPr>
         <w:t>입력 차원 불일치와 영상 지연을 reshape, 프레임 스킵, 표시 영상 리사이징으로 해결</w:t>
+      </w:r>
+    </w:p>
+    <w:p>
+      <w:pPr>
+        <w:spacing w:after="20" w:line="271" w:lineRule="auto"/>
+      </w:pPr>
+      <w:r>
+        <w:rPr>
+          <w:rFonts w:ascii="맑은 고딕" w:hAnsi="맑은 고딕" w:eastAsia="맑은 고딕"/>
+          <w:b w:val="0"/>
+          <w:color w:val="159A9C"/>
+          <w:sz w:val="16"/>
+        </w:rPr>
+        <w:t>기술: Python · YOLOv8 · TensorFlow/Keras · LSTM Autoencoder · Supabase · Streamlit</w:t>
       </w:r>
     </w:p>
     <w:p>
@@ -1158,6 +1329,20 @@
     </w:p>
     <w:p>
       <w:pPr>
+        <w:spacing w:after="20" w:line="271" w:lineRule="auto"/>
+      </w:pPr>
+      <w:r>
+        <w:rPr>
+          <w:rFonts w:ascii="맑은 고딕" w:hAnsi="맑은 고딕" w:eastAsia="맑은 고딕"/>
+          <w:b w:val="0"/>
+          <w:color w:val="159A9C"/>
+          <w:sz w:val="16"/>
+        </w:rPr>
+        <w:t>기술: Python · pandas · scikit-learn · XGBoost · Pipeline · Streamlit</w:t>
+      </w:r>
+    </w:p>
+    <w:p>
+      <w:pPr>
         <w:keepNext/>
         <w:spacing w:before="70" w:after="28"/>
       </w:pPr>
@@ -1212,6 +1397,20 @@
           <w:sz w:val="17"/>
         </w:rPr>
         <w:t>UTC/KST 발송 시간 차이를 Asia/Seoul 기준으로 보정하고 최종 Spring·FastAPI 프로젝트로 구조 확장</w:t>
+      </w:r>
+    </w:p>
+    <w:p>
+      <w:pPr>
+        <w:spacing w:after="20" w:line="271" w:lineRule="auto"/>
+      </w:pPr>
+      <w:r>
+        <w:rPr>
+          <w:rFonts w:ascii="맑은 고딕" w:hAnsi="맑은 고딕" w:eastAsia="맑은 고딕"/>
+          <w:b w:val="0"/>
+          <w:color w:val="159A9C"/>
+          <w:sz w:val="16"/>
+        </w:rPr>
+        <w:t>기술: Flask · React · OAuth/JWT · Gmail SMTP · Gemini · APScheduler</w:t>
       </w:r>
     </w:p>
     <w:p>
@@ -1285,120 +1484,6 @@
         </w:rPr>
         <w:t>기술: Java 17 · Spring Boot 2.7 · JSP · JPA · MyBatis · Oracle DB</w:t>
       </w:r>
-    </w:p>
-    <w:p>
-      <w:pPr>
-        <w:keepNext/>
-        <w:spacing w:before="120" w:after="70"/>
-        <w:pBdr>
-          <w:bottom w:val="single" w:sz="7" w:space="2" w:color="D9E0E6"/>
-        </w:pBdr>
-      </w:pPr>
-      <w:r>
-        <w:rPr>
-          <w:rFonts w:ascii="맑은 고딕" w:hAnsi="맑은 고딕" w:eastAsia="맑은 고딕"/>
-          <w:b/>
-          <w:color w:val="13283F"/>
-          <w:sz w:val="22"/>
-        </w:rPr>
-        <w:t>PORTFOLIO</w:t>
-      </w:r>
-    </w:p>
-    <w:p>
-      <w:pPr>
-        <w:spacing w:after="16" w:line="259" w:lineRule="auto"/>
-      </w:pPr>
-      <w:r>
-        <w:rPr>
-          <w:rFonts w:ascii="맑은 고딕" w:hAnsi="맑은 고딕" w:eastAsia="맑은 고딕"/>
-          <w:b/>
-          <w:color w:val="13283F"/>
-          <w:sz w:val="17"/>
-        </w:rPr>
-        <w:t>Portfolio</w:t>
-      </w:r>
-      <w:hyperlink r:id="rId11">
-        <w:r>
-          <w:rPr>
-            <w:rFonts w:ascii="맑은 고딕" w:hAnsi="맑은 고딕" w:eastAsia="맑은 고딕"/>
-            <w:b w:val="0"/>
-            <w:color w:val="13283F"/>
-            <w:sz w:val="17"/>
-          </w:rPr>
-        </w:r>
-      </w:hyperlink>
-    </w:p>
-    <w:p>
-      <w:pPr>
-        <w:spacing w:after="16" w:line="259" w:lineRule="auto"/>
-      </w:pPr>
-      <w:r>
-        <w:rPr>
-          <w:rFonts w:ascii="맑은 고딕" w:hAnsi="맑은 고딕" w:eastAsia="맑은 고딕"/>
-          <w:b/>
-          <w:color w:val="13283F"/>
-          <w:sz w:val="17"/>
-        </w:rPr>
-        <w:t>GitHub</w:t>
-      </w:r>
-      <w:hyperlink r:id="rId12">
-        <w:r>
-          <w:rPr>
-            <w:rFonts w:ascii="맑은 고딕" w:hAnsi="맑은 고딕" w:eastAsia="맑은 고딕"/>
-            <w:b w:val="0"/>
-            <w:color w:val="13283F"/>
-            <w:sz w:val="17"/>
-          </w:rPr>
-        </w:r>
-      </w:hyperlink>
-    </w:p>
-    <w:p>
-      <w:pPr>
-        <w:spacing w:after="16" w:line="259" w:lineRule="auto"/>
-      </w:pPr>
-      <w:r>
-        <w:rPr>
-          <w:rFonts w:ascii="맑은 고딕" w:hAnsi="맑은 고딕" w:eastAsia="맑은 고딕"/>
-          <w:b/>
-          <w:color w:val="13283F"/>
-          <w:sz w:val="17"/>
-        </w:rPr>
-        <w:t>BidMatch Project</w:t>
-      </w:r>
-      <w:hyperlink r:id="rId13">
-        <w:r>
-          <w:rPr>
-            <w:rFonts w:ascii="맑은 고딕" w:hAnsi="맑은 고딕" w:eastAsia="맑은 고딕"/>
-            <w:b w:val="0"/>
-            <w:color w:val="13283F"/>
-            <w:sz w:val="17"/>
-          </w:rPr>
-        </w:r>
-      </w:hyperlink>
-    </w:p>
-    <w:p>
-      <w:pPr>
-        <w:spacing w:after="16" w:line="259" w:lineRule="auto"/>
-      </w:pPr>
-      <w:r>
-        <w:rPr>
-          <w:rFonts w:ascii="맑은 고딕" w:hAnsi="맑은 고딕" w:eastAsia="맑은 고딕"/>
-          <w:b/>
-          <w:color w:val="13283F"/>
-          <w:sz w:val="17"/>
-        </w:rPr>
-        <w:t>BidMatch Service</w:t>
-      </w:r>
-      <w:hyperlink r:id="rId14">
-        <w:r>
-          <w:rPr>
-            <w:rFonts w:ascii="맑은 고딕" w:hAnsi="맑은 고딕" w:eastAsia="맑은 고딕"/>
-            <w:b w:val="0"/>
-            <w:color w:val="13283F"/>
-            <w:sz w:val="17"/>
-          </w:rPr>
-        </w:r>
-      </w:hyperlink>
     </w:p>
     <w:sectPr>
       <w:footerReference w:type="default" r:id="rId15"/>

</xml_diff>